<commit_message>
Rename compiler project to SUDARSHAN across codebase, docs, CLI wrapper, tests, and PDFs
</commit_message>
<xml_diff>
--- a/Phase1_Project_Report.docx
+++ b/Phase1_Project_Report.docx
@@ -46,7 +46,7 @@
         </w:rPr>
         <w:t>PROJECT TITLE:</w:t>
         <w:br/>
-        <w:t>MiniLang — A Compiler &amp; Interpreter for a Simple Imperative Language</w:t>
+        <w:t>Sudarshan: An End-to-End Compiler and Virtual Machine</w:t>
       </w:r>
     </w:p>
     <w:p>
@@ -87,7 +87,7 @@
         <w:spacing w:after="120" w:line="276" w:lineRule="auto"/>
       </w:pPr>
       <w:r>
-        <w:t>MiniLang is an individual Compiler Design Laboratory project that implements a fully modular, 5-phase compiler and virtual machine execution engine for a custom imperative programming language. Developed entirely in Python 3 without external parsing frameworks (such as Lex, Yacc, PLY, or ANTLR), MiniLang translates human-readable source code into formal tokens, constructs an Abstract Syntax Tree (AST) using an LL(1) Recursive Descent Parser, performs static semantics validation using a tree-structured Symbol Table, generates Three-Address Code (TAC) quadruples, applies compile-time constant folding optimizations, and executes the resulting intermediate code on a virtual machine environment.</w:t>
+        <w:t>Sudarshan is an individual Compiler Design Laboratory project that implements a fully modular, 5-phase compiler and virtual machine execution engine for a custom imperative programming language. Developed entirely in Python 3 without external parsing frameworks (such as Lex, Yacc, PLY, or ANTLR), Sudarshan translates human-readable source code into formal tokens, constructs an Abstract Syntax Tree (AST) using an LL(1) Recursive Descent Parser, performs static semantics validation using a tree-structured Symbol Table, generates Three-Address Code (TAC) quadruples, applies compile-time constant folding optimizations, and executes the resulting intermediate code on a virtual machine environment.</w:t>
       </w:r>
     </w:p>
     <w:p>
@@ -123,7 +123,7 @@
         <w:spacing w:after="120" w:line="276" w:lineRule="auto"/>
       </w:pPr>
       <w:r>
-        <w:t>Production compilers (such as GCC, Clang, or JVM) are industrial software systems comprising millions of lines of C/C++ code. For students learning Compiler Design, observing how source constructs transform through scanning, parsing, semantic validation, intermediate representation, optimization, and execution is often obscured by black-box parser generators or complex framework APIs. MiniLang addresses this challenge by providing a transparent, 100% handwritten, zero-dependency 5-phase compiler pipeline where every intermediate phase output can be inspected, debugged, and explained step-by-step.</w:t>
+        <w:t>Production compilers (such as GCC, Clang, or JVM) are industrial software systems comprising millions of lines of C/C++ code. For students learning Compiler Design, observing how source constructs transform through scanning, parsing, semantic validation, intermediate representation, optimization, and execution is often obscured by black-box parser generators or complex framework APIs. Sudarshan addresses this challenge by providing a transparent, 100% handwritten, zero-dependency 5-phase compiler pipeline where every intermediate phase output can be inspected, debugged, and explained step-by-step.</w:t>
       </w:r>
     </w:p>
     <w:p>
@@ -1372,7 +1372,7 @@
           </w:tcPr>
           <w:p>
             <w:r>
-              <w:t>Working CLI executable ./minilang &amp; python3 main.py</w:t>
+              <w:t>Working CLI executable ./sudarshan &amp; python3 main.py</w:t>
             </w:r>
           </w:p>
         </w:tc>
@@ -1431,7 +1431,7 @@
         </w:rPr>
         <w:t>cd /Users/lakshyasingh/.gemini/antigravity/scratch/MiniLang</w:t>
         <w:br/>
-        <w:t>./minilang examples/valid.mini --all</w:t>
+        <w:t>./sudarshan examples/valid.mini --all</w:t>
       </w:r>
     </w:p>
     <w:p>

</xml_diff>

<commit_message>
Highlight Key Innovations and Academic Novelty across documentation and Word report
</commit_message>
<xml_diff>
--- a/Phase1_Project_Report.docx
+++ b/Phase1_Project_Report.docx
@@ -885,6 +885,40 @@
     </w:p>
     <w:p>
       <w:pPr>
+        <w:spacing w:before="240" w:after="80"/>
+      </w:pPr>
+      <w:r>
+        <w:rPr>
+          <w:rFonts w:ascii="Calibri" w:hAnsi="Calibri"/>
+          <w:b/>
+          <w:color w:val="2E5B88"/>
+          <w:sz w:val="26"/>
+        </w:rPr>
+        <w:t>5.3 Key Innovations &amp; Academic Novelty</w:t>
+      </w:r>
+    </w:p>
+    <w:p>
+      <w:pPr>
+        <w:spacing w:after="120" w:line="276" w:lineRule="auto"/>
+      </w:pPr>
+      <w:r>
+        <w:t>To elevate Sudarshan beyond basic compiler laboratory requirements, six key technical innovations were implemented:</w:t>
+        <w:br/>
+        <w:t>1. Multi-Pass Constant Folding &amp; Propagation: Dynamically evaluates complex arithmetic expressions (e.g. 2 + 3 * 4 -&gt; 14) and comparison operators at compile time prior to virtual machine execution.</w:t>
+        <w:br/>
+        <w:t>2. Static Branch Pruning &amp; Dead Code Elimination: Identifies constant conditional jumps (e.g. IF_FALSE 0 GOTO L1 -&gt; JUMP L1) and eliminates dead quadruples following unconditional jumps.</w:t>
+        <w:br/>
+        <w:t>3. Scope Name Mangling for Register Isolation: Resolves variable shadowing in flat register-based Three-Address Code by appending scope level suffixes (e.g. x_s1), preserving lexical block isolation without stack frame overhead.</w:t>
+        <w:br/>
+        <w:t>4. AST ASCII Visualizer (dump_ast): Automatically formats hierarchical Abstract Syntax Tree structures into clean indented ASCII trees for lab demonstration without third-party graphing software.</w:t>
+        <w:br/>
+        <w:t>5. Zero-Dependency 100% Handwritten Architecture: Fully handwritten scanner, parser, symbol table manager, TAC IR generator, optimizer, and VM interpreter using Python 3 standard library.</w:t>
+        <w:br/>
+        <w:t>6. Educational Interactive CLI Explainer (--explain): Provides real-time transformation analytics across all 5 compiler phases.</w:t>
+      </w:r>
+    </w:p>
+    <w:p>
+      <w:pPr>
         <w:spacing w:before="360" w:after="120"/>
       </w:pPr>
       <w:r>

</xml_diff>